<commit_message>
KOS-9 percorso del logo nei comandi di installazione
Co-Authored-By: Claude Opus 5.5 <noreply@anthropic.com>
Claude-Session: https://claude.ai/code/session_01Rr1X44gsg7BUwMzrRvYrc2
</commit_message>
<xml_diff>
--- a/docs/docx/kos-9-12-13.docx
+++ b/docs/docx/kos-9-12-13.docx
@@ -1024,6 +1024,33 @@
         <w:rPr>
           <w:rStyle w:val="NormalTok"/>
         </w:rPr>
+        <w:t xml:space="preserve">ssh kos</w:t>
+      </w:r>
+      <w:r>
+        <w:rPr>
+          <w:rStyle w:val="OperatorTok"/>
+        </w:rPr>
+        <w:t xml:space="preserve">-</w:t>
+      </w:r>
+      <w:r>
+        <w:rPr>
+          <w:rStyle w:val="NormalTok"/>
+        </w:rPr>
+        <w:t xml:space="preserve">stage </w:t>
+      </w:r>
+      <w:r>
+        <w:rPr>
+          <w:rStyle w:val="StringTok"/>
+        </w:rPr>
+        <w:t xml:space="preserve">"mkdir -p /www/assets/img/logo"</w:t>
+      </w:r>
+      <w:r>
+        <w:br/>
+      </w:r>
+      <w:r>
+        <w:rPr>
+          <w:rStyle w:val="NormalTok"/>
+        </w:rPr>
         <w:t xml:space="preserve">scp shared</w:t>
       </w:r>
       <w:r>
@@ -1132,7 +1159,7 @@
         <w:rPr>
           <w:rStyle w:val="OperatorTok"/>
         </w:rPr>
-        <w:t xml:space="preserve">:</w:t>
+        <w:t xml:space="preserve">:/</w:t>
       </w:r>
       <w:r>
         <w:rPr>

</xml_diff>

<commit_message>
KOS-9 nome dell'ente secondo la lingua: Gruppo KOS in italiano, KOS Group in inglese
Co-Authored-By: Claude Opus 5.5 <noreply@anthropic.com>
Claude-Session: https://claude.ai/code/session_01Rr1X44gsg7BUwMzrRvYrc2
</commit_message>
<xml_diff>
--- a/docs/docx/kos-9-12-13.docx
+++ b/docs/docx/kos-9-12-13.docx
@@ -364,40 +364,31 @@
         <w:t xml:space="preserve"> </w:t>
       </w:r>
       <w:r>
-        <w:t xml:space="preserve">(direzione e coordinamento, dal footer). Lo stesso nodo su pagine italiane e inglesi: l'entità è una sola</w:t>
-      </w:r>
-      <w:r>
-        <w:t xml:space="preserve"> </w:t>
-      </w:r>
-      <w:r>
-        <w:t xml:space="preserve">(versione EN della voce 9 = stesso ente con nome inglese in</w:t>
-      </w:r>
-      <w:r>
-        <w:t xml:space="preserve"> </w:t>
-      </w:r>
-      <w:r>
-        <w:rPr>
-          <w:rStyle w:val="VerbatimChar"/>
-        </w:rPr>
-        <w:t xml:space="preserve">alternateName</w:t>
-      </w:r>
-      <w:r>
-        <w:t xml:space="preserve">, pagina con</w:t>
-      </w:r>
-      <w:r>
-        <w:t xml:space="preserve"> </w:t>
-      </w:r>
-      <w:r>
-        <w:rPr>
-          <w:rStyle w:val="VerbatimChar"/>
-        </w:rPr>
-        <w:t xml:space="preserve">inLanguage</w:t>
-      </w:r>
-      <w:r>
-        <w:t xml:space="preserve"> </w:t>
-      </w:r>
-      <w:r>
-        <w:t xml:space="preserve">en-GB).</w:t>
+        <w:t xml:space="preserve">(direzione e coordinamento, dal footer). Nome secondo la lingua della pagina: «Gruppo KOS» sulle pagine</w:t>
+      </w:r>
+      <w:r>
+        <w:t xml:space="preserve"> </w:t>
+      </w:r>
+      <w:r>
+        <w:t xml:space="preserve">italiane (alternateName «KOS Group»), «KOS Group» su quelle inglesi (alternateName «Gruppo KOS»), con lo</w:t>
+      </w:r>
+      <w:r>
+        <w:t xml:space="preserve"> </w:t>
+      </w:r>
+      <w:r>
+        <w:t xml:space="preserve">stesso</w:t>
+      </w:r>
+      <w:r>
+        <w:t xml:space="preserve"> </w:t>
+      </w:r>
+      <w:r>
+        <w:rPr>
+          <w:rStyle w:val="VerbatimChar"/>
+        </w:rPr>
+        <w:t xml:space="preserve">@id</w:t>
+      </w:r>
+      <w:r>
+        <w:t xml:space="preserve">: l'entità è una sola (versione EN richiesta dalla voce 9).</w:t>
       </w:r>
     </w:p>
     <w:p>

</xml_diff>

<commit_message>
KOS-12 BreadcrumbList anche sulle pagine che richiamano il chunk breadcrumb nel contenuto
Co-Authored-By: Claude Opus 5.5 <noreply@anthropic.com>
Claude-Session: https://claude.ai/code/session_01Rr1X44gsg7BUwMzrRvYrc2
</commit_message>
<xml_diff>
--- a/docs/docx/kos-9-12-13.docx
+++ b/docs/docx/kos-9-12-13.docx
@@ -576,7 +576,7 @@
         <w:t xml:space="preserve"> </w:t>
       </w:r>
       <w:r>
-        <w:t xml:space="preserve">e pagine che richiamano</w:t>
+        <w:t xml:space="preserve">e pagine che richiamano nel contenuto</w:t>
       </w:r>
       <w:r>
         <w:t xml:space="preserve"> </w:t>
@@ -591,7 +591,67 @@
         <w:t xml:space="preserve"> </w:t>
       </w:r>
       <w:r>
-        <w:t xml:space="preserve">nel contenuto.</w:t>
+        <w:t xml:space="preserve">o il chunk</w:t>
+      </w:r>
+      <w:r>
+        <w:t xml:space="preserve"> </w:t>
+      </w:r>
+      <w:r>
+        <w:rPr>
+          <w:rStyle w:val="VerbatimChar"/>
+        </w:rPr>
+        <w:t xml:space="preserve">breadcrumb</w:t>
+      </w:r>
+      <w:r>
+        <w:t xml:space="preserve"> </w:t>
+      </w:r>
+      <w:r>
+        <w:t xml:space="preserve">(es.</w:t>
+      </w:r>
+      <w:r>
+        <w:t xml:space="preserve"> </w:t>
+      </w:r>
+      <w:r>
+        <w:rPr>
+          <w:rStyle w:val="VerbatimChar"/>
+        </w:rPr>
+        <w:t xml:space="preserve">/it/news-e-media/news</w:t>
+      </w:r>
+      <w:r>
+        <w:t xml:space="preserve">, pagine</w:t>
+      </w:r>
+      <w:r>
+        <w:t xml:space="preserve"> </w:t>
+      </w:r>
+      <w:r>
+        <w:rPr>
+          <w:rStyle w:val="VerbatimChar"/>
+        </w:rPr>
+        <w:t xml:space="preserve">generica-en</w:t>
+      </w:r>
+      <w:r>
+        <w:t xml:space="preserve"> </w:t>
+      </w:r>
+      <w:r>
+        <w:t xml:space="preserve">come</w:t>
+      </w:r>
+      <w:r>
+        <w:t xml:space="preserve"> </w:t>
+      </w:r>
+      <w:r>
+        <w:rPr>
+          <w:rStyle w:val="VerbatimChar"/>
+        </w:rPr>
+        <w:t xml:space="preserve">/en/terms-and-conditions</w:t>
+      </w:r>
+      <w:r>
+        <w:t xml:space="preserve">: corretto il 22/10 dopo il</w:t>
+      </w:r>
+      <w:r>
+        <w:t xml:space="preserve"> </w:t>
+      </w:r>
+      <w:r>
+        <w:t xml:space="preserve">collaudo sullo stage).</w:t>
       </w:r>
     </w:p>
     <w:bookmarkEnd w:id="20"/>

</xml_diff>

<commit_message>
KOS-24 annotato il JSON-LD inserito da Yext Knowledge Tags sulle schede struttura
Co-Authored-By: Claude Opus 5.5 <noreply@anthropic.com>
Claude-Session: https://claude.ai/code/session_01Rr1X44gsg7BUwMzrRvYrc2
</commit_message>
<xml_diff>
--- a/docs/docx/kos-9-12-13.docx
+++ b/docs/docx/kos-9-12-13.docx
@@ -1046,6 +1046,156 @@
       </w:r>
       <w:r>
         <w:t xml:space="preserve">BreadcrumbList): si sistemano con la voce 24 (dato strutturato delle strutture, stesso sprint).</w:t>
+      </w:r>
+    </w:p>
+    <w:p>
+      <w:pPr>
+        <w:numPr>
+          <w:ilvl w:val="0"/>
+          <w:numId w:val="1004"/>
+        </w:numPr>
+        <w:pStyle w:val="Compact"/>
+      </w:pPr>
+      <w:r>
+        <w:t xml:space="preserve">Schede struttura: lo script Yext Knowledge Tags (</w:t>
+      </w:r>
+      <w:r>
+        <w:rPr>
+          <w:rStyle w:val="VerbatimChar"/>
+        </w:rPr>
+        <w:t xml:space="preserve">knowledgetags.yextapis.com/embed</w:t>
+      </w:r>
+      <w:r>
+        <w:t xml:space="preserve">, già in produzione) inserisce</w:t>
+      </w:r>
+      <w:r>
+        <w:t xml:space="preserve"> </w:t>
+      </w:r>
+      <w:r>
+        <w:t xml:space="preserve">via JavaScript un secondo blocco JSON-LD, visto dal Rich Results Test il 22/10 su</w:t>
+      </w:r>
+      <w:r>
+        <w:t xml:space="preserve"> </w:t>
+      </w:r>
+      <w:r>
+        <w:rPr>
+          <w:rStyle w:val="VerbatimChar"/>
+        </w:rPr>
+        <w:t xml:space="preserve">/it/centri/villa-sant-alessandro</w:t>
+      </w:r>
+      <w:r>
+        <w:t xml:space="preserve">:</w:t>
+      </w:r>
+      <w:r>
+        <w:t xml:space="preserve"> </w:t>
+      </w:r>
+      <w:r>
+        <w:rPr>
+          <w:rStyle w:val="VerbatimChar"/>
+        </w:rPr>
+        <w:t xml:space="preserve">MedicalClinic</w:t>
+      </w:r>
+      <w:r>
+        <w:t xml:space="preserve"> </w:t>
+      </w:r>
+      <w:r>
+        <w:t xml:space="preserve">+</w:t>
+      </w:r>
+      <w:r>
+        <w:t xml:space="preserve"> </w:t>
+      </w:r>
+      <w:r>
+        <w:rPr>
+          <w:rStyle w:val="VerbatimChar"/>
+        </w:rPr>
+        <w:t xml:space="preserve">Psychiatric</w:t>
+      </w:r>
+      <w:r>
+        <w:t xml:space="preserve"> </w:t>
+      </w:r>
+      <w:r>
+        <w:t xml:space="preserve">(che è una specialità, non un tipo),</w:t>
+      </w:r>
+      <w:r>
+        <w:t xml:space="preserve"> </w:t>
+      </w:r>
+      <w:r>
+        <w:rPr>
+          <w:rStyle w:val="VerbatimChar"/>
+        </w:rPr>
+        <w:t xml:space="preserve">@id</w:t>
+      </w:r>
+      <w:r>
+        <w:t xml:space="preserve"> </w:t>
+      </w:r>
+      <w:r>
+        <w:rPr>
+          <w:rStyle w:val="VerbatimChar"/>
+        </w:rPr>
+        <w:t xml:space="preserve">http://example-test.site/KCA00_OSA</w:t>
+      </w:r>
+      <w:r>
+        <w:t xml:space="preserve">,</w:t>
+      </w:r>
+      <w:r>
+        <w:t xml:space="preserve"> </w:t>
+      </w:r>
+      <w:r>
+        <w:rPr>
+          <w:rStyle w:val="VerbatimChar"/>
+        </w:rPr>
+        <w:t xml:space="preserve">sameAs</w:t>
+      </w:r>
+      <w:r>
+        <w:t xml:space="preserve"> </w:t>
+      </w:r>
+      <w:r>
+        <w:t xml:space="preserve">verso la pagina Yext su location.com, orari 08-20 tutti i giorni, nessun legame con</w:t>
+      </w:r>
+      <w:r>
+        <w:t xml:space="preserve"> </w:t>
+      </w:r>
+      <w:r>
+        <w:rPr>
+          <w:rStyle w:val="VerbatimChar"/>
+        </w:rPr>
+        <w:t xml:space="preserve">#organization</w:t>
+      </w:r>
+      <w:r>
+        <w:t xml:space="preserve">.</w:t>
+      </w:r>
+      <w:r>
+        <w:t xml:space="preserve"> </w:t>
+      </w:r>
+      <w:r>
+        <w:t xml:space="preserve">Non dipende da questo pacchetto; si decide con la voce 24: nodo</w:t>
+      </w:r>
+      <w:r>
+        <w:t xml:space="preserve"> </w:t>
+      </w:r>
+      <w:r>
+        <w:rPr>
+          <w:rStyle w:val="VerbatimChar"/>
+        </w:rPr>
+        <w:t xml:space="preserve">#localbusiness</w:t>
+      </w:r>
+      <w:r>
+        <w:t xml:space="preserve"> </w:t>
+      </w:r>
+      <w:r>
+        <w:t xml:space="preserve">emesso dalla libreria e</w:t>
+      </w:r>
+      <w:r>
+        <w:t xml:space="preserve"> </w:t>
+      </w:r>
+      <w:r>
+        <w:t xml:space="preserve">rimozione dello script Yext dalle schede (anticipando la migrazione a RetailTune), con i dati (orari, telefono,</w:t>
+      </w:r>
+      <w:r>
+        <w:t xml:space="preserve"> </w:t>
+      </w:r>
+      <w:r>
+        <w:t xml:space="preserve">email) da verificare con KOS.</w:t>
       </w:r>
     </w:p>
     <w:bookmarkEnd w:id="22"/>

</xml_diff>

<commit_message>
KOS-9 KOS-12 KOS-13 in produzione: annotati rilasci e ripristino
Co-Authored-By: Claude Opus 5.5 <noreply@anthropic.com>
Claude-Session: https://claude.ai/code/session_01Rr1X44gsg7BUwMzrRvYrc2
</commit_message>
<xml_diff>
--- a/docs/docx/kos-9-12-13.docx
+++ b/docs/docx/kos-9-12-13.docx
@@ -2,7 +2,7 @@
 <file path=word/document.xml><?xml version="1.0" encoding="utf-8"?>
 <w:document xmlns:w="http://schemas.openxmlformats.org/wordprocessingml/2006/main" xmlns:m="http://schemas.openxmlformats.org/officeDocument/2006/math" xmlns:r="http://schemas.openxmlformats.org/officeDocument/2006/relationships" xmlns:o="urn:schemas-microsoft-com:office:office" xmlns:v="urn:schemas-microsoft-com:vml" xmlns:w10="urn:schemas-microsoft-com:office:word" xmlns:a="http://schemas.openxmlformats.org/drawingml/2006/main" xmlns:pic="http://schemas.openxmlformats.org/drawingml/2006/picture" xmlns:wp="http://schemas.openxmlformats.org/drawingml/2006/wordprocessingDrawing">
   <w:body>
-    <w:bookmarkStart w:id="24" w:name="X40dce15cb1c8384b04c94779e495833c22e8e1b"/>
+    <w:bookmarkStart w:id="25" w:name="X40dce15cb1c8384b04c94779e495833c22e8e1b"/>
     <w:p>
       <w:pPr>
         <w:pStyle w:val="Heading1"/>
@@ -1657,7 +1657,220 @@
       </w:r>
     </w:p>
     <w:bookmarkEnd w:id="23"/>
+    <w:bookmarkStart w:id="24" w:name="rilasci"/>
+    <w:p>
+      <w:pPr>
+        <w:pStyle w:val="Heading2"/>
+      </w:pPr>
+      <w:r>
+        <w:t xml:space="preserve">Rilasci</w:t>
+      </w:r>
+    </w:p>
+    <w:tbl>
+      <w:tblPr>
+        <w:tblStyle w:val="Table"/>
+        <w:tblW w:type="auto" w:w="0"/>
+        <w:tblLook w:firstRow="1" w:lastRow="0" w:firstColumn="0" w:lastColumn="0" w:noHBand="0" w:noVBand="0" w:val="0020"/>
+        <w:jc w:val="start"/>
+      </w:tblPr>
+      <w:tblGrid>
+        <w:gridCol w:w="2640"/>
+        <w:gridCol w:w="2640"/>
+        <w:gridCol w:w="2640"/>
+      </w:tblGrid>
+      <w:tr>
+        <w:trPr>
+          <w:tblHeader w:val="true"/>
+        </w:trPr>
+        <w:tc>
+          <w:tcPr/>
+          <w:p>
+            <w:pPr>
+              <w:pStyle w:val="Compact"/>
+              <w:jc w:val="left"/>
+            </w:pPr>
+            <w:r>
+              <w:t xml:space="preserve">Data</w:t>
+            </w:r>
+          </w:p>
+        </w:tc>
+        <w:tc>
+          <w:tcPr/>
+          <w:p>
+            <w:pPr>
+              <w:pStyle w:val="Compact"/>
+              <w:jc w:val="left"/>
+            </w:pPr>
+            <w:r>
+              <w:t xml:space="preserve">Ambiente</w:t>
+            </w:r>
+          </w:p>
+        </w:tc>
+        <w:tc>
+          <w:tcPr/>
+          <w:p>
+            <w:pPr>
+              <w:pStyle w:val="Compact"/>
+              <w:jc w:val="left"/>
+            </w:pPr>
+            <w:r>
+              <w:t xml:space="preserve">Manifest di ripristino</w:t>
+            </w:r>
+          </w:p>
+        </w:tc>
+      </w:tr>
+      <w:tr>
+        <w:tc>
+          <w:tcPr/>
+          <w:p>
+            <w:pPr>
+              <w:pStyle w:val="Compact"/>
+              <w:jc w:val="left"/>
+            </w:pPr>
+            <w:r>
+              <w:t xml:space="preserve">22/10/2026</w:t>
+            </w:r>
+          </w:p>
+        </w:tc>
+        <w:tc>
+          <w:tcPr/>
+          <w:p>
+            <w:pPr>
+              <w:pStyle w:val="Compact"/>
+              <w:jc w:val="left"/>
+            </w:pPr>
+            <w:r>
+              <w:t xml:space="preserve">stage (dopo il riallineamento dalla produzione)</w:t>
+            </w:r>
+          </w:p>
+        </w:tc>
+        <w:tc>
+          <w:tcPr/>
+          <w:p>
+            <w:pPr>
+              <w:pStyle w:val="Compact"/>
+              <w:jc w:val="left"/>
+            </w:pPr>
+            <w:r>
+              <w:rPr>
+                <w:rStyle w:val="VerbatimChar"/>
+              </w:rPr>
+              <w:t xml:space="preserve">/paas/c0044/backup-kos-seo-geo/20261022-073855/ripristino.json</w:t>
+            </w:r>
+            <w:r>
+              <w:t xml:space="preserve"> </w:t>
+            </w:r>
+            <w:r>
+              <w:t xml:space="preserve">(pacchetto intero);</w:t>
+            </w:r>
+            <w:r>
+              <w:t xml:space="preserve"> </w:t>
+            </w:r>
+            <w:r>
+              <w:rPr>
+                <w:rStyle w:val="VerbatimChar"/>
+              </w:rPr>
+              <w:t xml:space="preserve">…/20261022-074617/</w:t>
+            </w:r>
+            <w:r>
+              <w:t xml:space="preserve"> </w:t>
+            </w:r>
+            <w:r>
+              <w:t xml:space="preserve">solo</w:t>
+            </w:r>
+            <w:r>
+              <w:t xml:space="preserve"> </w:t>
+            </w:r>
+            <w:r>
+              <w:rPr>
+                <w:rStyle w:val="VerbatimChar"/>
+              </w:rPr>
+              <w:t xml:space="preserve">kosSchema</w:t>
+            </w:r>
+          </w:p>
+        </w:tc>
+      </w:tr>
+      <w:tr>
+        <w:tc>
+          <w:tcPr/>
+          <w:p>
+            <w:pPr>
+              <w:pStyle w:val="Compact"/>
+              <w:jc w:val="left"/>
+            </w:pPr>
+            <w:r>
+              <w:t xml:space="preserve">22/10/2026</w:t>
+            </w:r>
+          </w:p>
+        </w:tc>
+        <w:tc>
+          <w:tcPr/>
+          <w:p>
+            <w:pPr>
+              <w:pStyle w:val="Compact"/>
+              <w:jc w:val="left"/>
+            </w:pPr>
+            <w:r>
+              <w:t xml:space="preserve">produzione</w:t>
+            </w:r>
+          </w:p>
+        </w:tc>
+        <w:tc>
+          <w:tcPr/>
+          <w:p>
+            <w:pPr>
+              <w:pStyle w:val="Compact"/>
+              <w:jc w:val="left"/>
+            </w:pPr>
+            <w:r>
+              <w:rPr>
+                <w:rStyle w:val="VerbatimChar"/>
+              </w:rPr>
+              <w:t xml:space="preserve">/paas/c0095/backup-kos-seo-geo/20261022-081117/ripristino.json</w:t>
+            </w:r>
+          </w:p>
+        </w:tc>
+      </w:tr>
+    </w:tbl>
+    <w:p>
+      <w:pPr>
+        <w:pStyle w:val="BodyText"/>
+      </w:pPr>
+      <w:r>
+        <w:t xml:space="preserve">Ripristino in produzione:</w:t>
+      </w:r>
+    </w:p>
+    <w:p>
+      <w:pPr>
+        <w:pStyle w:val="SourceCode"/>
+      </w:pPr>
+      <w:r>
+        <w:rPr>
+          <w:rStyle w:val="NormalTok"/>
+        </w:rPr>
+        <w:t xml:space="preserve">ssh kos</w:t>
+      </w:r>
+      <w:r>
+        <w:rPr>
+          <w:rStyle w:val="OperatorTok"/>
+        </w:rPr>
+        <w:t xml:space="preserve">-</w:t>
+      </w:r>
+      <w:r>
+        <w:rPr>
+          <w:rStyle w:val="NormalTok"/>
+        </w:rPr>
+        <w:t xml:space="preserve">prod </w:t>
+      </w:r>
+      <w:r>
+        <w:rPr>
+          <w:rStyle w:val="StringTok"/>
+        </w:rPr>
+        <w:t xml:space="preserve">"cd ~/kos-seo-geo &amp;&amp; php scripts/deploy/installa-elementi.php /www /paas/c0095/backup-kos-seo-geo/20261022-081117/ripristino.json --scrivi"</w:t>
+      </w:r>
+    </w:p>
     <w:bookmarkEnd w:id="24"/>
+    <w:bookmarkEnd w:id="25"/>
     <w:sectPr/>
   </w:body>
 </w:document>

</xml_diff>

<commit_message>
KOS-24 analisi del JSON-LD Yext sulle 61 schede struttura, archivio delle evidenze
Co-Authored-By: Claude Opus 5.5 <noreply@anthropic.com>
Claude-Session: https://claude.ai/code/session_01Rr1X44gsg7BUwMzrRvYrc2
</commit_message>
<xml_diff>
--- a/docs/docx/kos-9-12-13.docx
+++ b/docs/docx/kos-9-12-13.docx
@@ -1129,13 +1129,34 @@
         <w:t xml:space="preserve"> </w:t>
       </w:r>
       <w:r>
+        <w:t xml:space="preserve">relativo</w:t>
+      </w:r>
+      <w:r>
+        <w:t xml:space="preserve"> </w:t>
+      </w:r>
+      <w:r>
+        <w:rPr>
+          <w:rStyle w:val="VerbatimChar"/>
+        </w:rPr>
+        <w:t xml:space="preserve">KCA00_OSA</w:t>
+      </w:r>
+      <w:r>
+        <w:t xml:space="preserve"> </w:t>
+      </w:r>
+      <w:r>
+        <w:t xml:space="preserve">(il Rich Results Test lo mostra come</w:t>
+      </w:r>
+      <w:r>
+        <w:t xml:space="preserve"> </w:t>
+      </w:r>
+      <w:r>
         <w:rPr>
           <w:rStyle w:val="VerbatimChar"/>
         </w:rPr>
         <w:t xml:space="preserve">http://example-test.site/KCA00_OSA</w:t>
       </w:r>
       <w:r>
-        <w:t xml:space="preserve">,</w:t>
+        <w:t xml:space="preserve">),</w:t>
       </w:r>
       <w:r>
         <w:t xml:space="preserve"> </w:t>
@@ -1160,6 +1181,18 @@
           <w:rStyle w:val="VerbatimChar"/>
         </w:rPr>
         <w:t xml:space="preserve">#organization</w:t>
+      </w:r>
+      <w:r>
+        <w:t xml:space="preserve">. Analisi di tutte le schede:</w:t>
+      </w:r>
+      <w:r>
+        <w:t xml:space="preserve"> </w:t>
+      </w:r>
+      <w:r>
+        <w:rPr>
+          <w:rStyle w:val="VerbatimChar"/>
+        </w:rPr>
+        <w:t xml:space="preserve">docs/yext-schema-kos.md</w:t>
       </w:r>
       <w:r>
         <w:t xml:space="preserve">.</w:t>

</xml_diff>

<commit_message>
KOS-12: correzione delle briciole doppie in produzione (25/10), documentata
Co-Authored-By: Claude Opus 5.5 <noreply@anthropic.com>
Claude-Session: https://claude.ai/code/session_01Rr1X44gsg7BUwMzrRvYrc2
</commit_message>
<xml_diff>
--- a/docs/docx/kos-9-12-13.docx
+++ b/docs/docx/kos-9-12-13.docx
@@ -2,7 +2,7 @@
 <file path=word/document.xml><?xml version="1.0" encoding="utf-8"?>
 <w:document xmlns:w="http://schemas.openxmlformats.org/wordprocessingml/2006/main" xmlns:m="http://schemas.openxmlformats.org/officeDocument/2006/math" xmlns:r="http://schemas.openxmlformats.org/officeDocument/2006/relationships" xmlns:o="urn:schemas-microsoft-com:office:office" xmlns:v="urn:schemas-microsoft-com:vml" xmlns:w10="urn:schemas-microsoft-com:office:word" xmlns:a="http://schemas.openxmlformats.org/drawingml/2006/main" xmlns:pic="http://schemas.openxmlformats.org/drawingml/2006/picture" xmlns:wp="http://schemas.openxmlformats.org/drawingml/2006/wordprocessingDrawing">
   <w:body>
-    <w:bookmarkStart w:id="25" w:name="X40dce15cb1c8384b04c94779e495833c22e8e1b"/>
+    <w:bookmarkStart w:id="26" w:name="X40dce15cb1c8384b04c94779e495833c22e8e1b"/>
     <w:p>
       <w:pPr>
         <w:pStyle w:val="Heading1"/>
@@ -1903,7 +1903,166 @@
       </w:r>
     </w:p>
     <w:bookmarkEnd w:id="24"/>
+    <w:bookmarkStart w:id="25" w:name="correzione-del-2510-briciole-doppie"/>
+    <w:p>
+      <w:pPr>
+        <w:pStyle w:val="Heading2"/>
+      </w:pPr>
+      <w:r>
+        <w:t xml:space="preserve">Correzione del 25/10: briciole doppie</w:t>
+      </w:r>
+    </w:p>
+    <w:p>
+      <w:pPr>
+        <w:pStyle w:val="FirstParagraph"/>
+      </w:pPr>
+      <w:r>
+        <w:t xml:space="preserve">Le briciole aggiunte il 22/10 nei template</w:t>
+      </w:r>
+      <w:r>
+        <w:t xml:space="preserve"> </w:t>
+      </w:r>
+      <w:r>
+        <w:rPr>
+          <w:rStyle w:val="VerbatimChar"/>
+        </w:rPr>
+        <w:t xml:space="preserve">strutture</w:t>
+      </w:r>
+      <w:r>
+        <w:t xml:space="preserve">,</w:t>
+      </w:r>
+      <w:r>
+        <w:t xml:space="preserve"> </w:t>
+      </w:r>
+      <w:r>
+        <w:rPr>
+          <w:rStyle w:val="VerbatimChar"/>
+        </w:rPr>
+        <w:t xml:space="preserve">strutture-VDP</w:t>
+      </w:r>
+      <w:r>
+        <w:t xml:space="preserve">,</w:t>
+      </w:r>
+      <w:r>
+        <w:t xml:space="preserve"> </w:t>
+      </w:r>
+      <w:r>
+        <w:rPr>
+          <w:rStyle w:val="VerbatimChar"/>
+        </w:rPr>
+        <w:t xml:space="preserve">cure</w:t>
+      </w:r>
+      <w:r>
+        <w:t xml:space="preserve"> </w:t>
+      </w:r>
+      <w:r>
+        <w:t xml:space="preserve">e</w:t>
+      </w:r>
+      <w:r>
+        <w:t xml:space="preserve"> </w:t>
+      </w:r>
+      <w:r>
+        <w:rPr>
+          <w:rStyle w:val="VerbatimChar"/>
+        </w:rPr>
+        <w:t xml:space="preserve">specializzazioni</w:t>
+      </w:r>
+      <w:r>
+        <w:t xml:space="preserve"> </w:t>
+      </w:r>
+      <w:r>
+        <w:t xml:space="preserve">si sommavano a</w:t>
+      </w:r>
+      <w:r>
+        <w:t xml:space="preserve"> </w:t>
+      </w:r>
+      <w:r>
+        <w:t xml:space="preserve">quelle che tutte le 161 pagine di questi template richiamano già nel contenuto (chunk</w:t>
+      </w:r>
+      <w:r>
+        <w:t xml:space="preserve"> </w:t>
+      </w:r>
+      <w:r>
+        <w:rPr>
+          <w:rStyle w:val="VerbatimChar"/>
+        </w:rPr>
+        <w:t xml:space="preserve">breadcrumb</w:t>
+      </w:r>
+      <w:r>
+        <w:t xml:space="preserve">, che fino al 22/10</w:t>
+      </w:r>
+      <w:r>
+        <w:t xml:space="preserve"> </w:t>
+      </w:r>
+      <w:r>
+        <w:t xml:space="preserve">usava pdoCrumbs): dal 22/10 al 25/10 le briciole comparivano due volte. I quattro template sono tornati alla versione</w:t>
+      </w:r>
+      <w:r>
+        <w:t xml:space="preserve"> </w:t>
+      </w:r>
+      <w:r>
+        <w:t xml:space="preserve">di partenza (pacchetto</w:t>
+      </w:r>
+      <w:r>
+        <w:t xml:space="preserve"> </w:t>
+      </w:r>
+      <w:r>
+        <w:rPr>
+          <w:rStyle w:val="VerbatimChar"/>
+        </w:rPr>
+        <w:t xml:space="preserve">kosgroup/deploy/kos-12-briciole.json</w:t>
+      </w:r>
+      <w:r>
+        <w:t xml:space="preserve">, in produzione il 25/10); le briciole restano quelle del</w:t>
+      </w:r>
+      <w:r>
+        <w:t xml:space="preserve"> </w:t>
+      </w:r>
+      <w:r>
+        <w:t xml:space="preserve">contenuto, generate da</w:t>
+      </w:r>
+      <w:r>
+        <w:t xml:space="preserve"> </w:t>
+      </w:r>
+      <w:r>
+        <w:rPr>
+          <w:rStyle w:val="VerbatimChar"/>
+        </w:rPr>
+        <w:t xml:space="preserve">kosSchema</w:t>
+      </w:r>
+      <w:r>
+        <w:t xml:space="preserve">, e il</w:t>
+      </w:r>
+      <w:r>
+        <w:t xml:space="preserve"> </w:t>
+      </w:r>
+      <w:r>
+        <w:rPr>
+          <w:rStyle w:val="VerbatimChar"/>
+        </w:rPr>
+        <w:t xml:space="preserve">BreadcrumbList</w:t>
+      </w:r>
+      <w:r>
+        <w:t xml:space="preserve"> </w:t>
+      </w:r>
+      <w:r>
+        <w:t xml:space="preserve">non cambia. Controllo:</w:t>
+      </w:r>
+      <w:r>
+        <w:t xml:space="preserve"> </w:t>
+      </w:r>
+      <w:r>
+        <w:rPr>
+          <w:rStyle w:val="VerbatimChar"/>
+        </w:rPr>
+        <w:t xml:space="preserve">scripts/checks/kos-briciole-doppie.php</w:t>
+      </w:r>
+      <w:r>
+        <w:t xml:space="preserve">.</w:t>
+      </w:r>
+    </w:p>
     <w:bookmarkEnd w:id="25"/>
+    <w:bookmarkEnd w:id="26"/>
     <w:sectPr/>
   </w:body>
 </w:document>

</xml_diff>